<commit_message>
Wow more gibberish added!
</commit_message>
<xml_diff>
--- a/second submission 02.docx
+++ b/second submission 02.docx
@@ -1,6 +1,6 @@
 
 <file path=word/document.xml><?xml version="1.0" encoding="utf-8"?>
-<w:document xmlns:wpc="http://schemas.microsoft.com/office/word/2010/wordprocessingCanvas" xmlns:cx="http://schemas.microsoft.com/office/drawing/2014/chartex" xmlns:cx1="http://schemas.microsoft.com/office/drawing/2015/9/8/chartex" xmlns:cx2="http://schemas.microsoft.com/office/drawing/2015/10/21/chartex" xmlns:cx3="http://schemas.microsoft.com/office/drawing/2016/5/9/chartex" xmlns:cx4="http://schemas.microsoft.com/office/drawing/2016/5/10/chartex" xmlns:cx5="http://schemas.microsoft.com/office/drawing/2016/5/11/chartex" xmlns:cx6="http://schemas.microsoft.com/office/drawing/2016/5/12/chartex" xmlns:cx7="http://schemas.microsoft.com/office/drawing/2016/5/13/chartex" xmlns:cx8="http://schemas.microsoft.com/office/drawing/2016/5/14/chartex" xmlns:mc="http://schemas.openxmlformats.org/markup-compatibility/2006" xmlns:aink="http://schemas.microsoft.com/office/drawing/2016/ink" xmlns:am3d="http://schemas.microsoft.com/office/drawing/2017/model3d" xmlns:o="urn:schemas-microsoft-com:office:office" xmlns:oel="http://schemas.microsoft.com/office/2019/extlst" xmlns:r="http://schemas.openxmlformats.org/officeDocument/2006/relationships" xmlns:m="http://schemas.openxmlformats.org/officeDocument/2006/math" xmlns:v="urn:schemas-microsoft-com:vml" xmlns:wp14="http://schemas.microsoft.com/office/word/2010/wordprocessingDrawing" xmlns:wp="http://schemas.openxmlformats.org/drawingml/2006/wordprocessingDrawing" xmlns:w10="urn:schemas-microsoft-com:office:word" xmlns:w="http://schemas.openxmlformats.org/wordprocessingml/2006/main" xmlns:w14="http://schemas.microsoft.com/office/word/2010/wordml" xmlns:w15="http://schemas.microsoft.com/office/word/2012/wordml" xmlns:w16cex="http://schemas.microsoft.com/office/word/2018/wordml/cex" xmlns:w16cid="http://schemas.microsoft.com/office/word/2016/wordml/cid" xmlns:w16="http://schemas.microsoft.com/office/word/2018/wordml" xmlns:w16du="http://schemas.microsoft.com/office/word/2023/wordml/word16du" xmlns:w16sdtdh="http://schemas.microsoft.com/office/word/2020/wordml/sdtdatahash" xmlns:w16sdtfl="http://schemas.microsoft.com/office/word/2024/wordml/sdtformatlock" xmlns:w16se="http://schemas.microsoft.com/office/word/2015/wordml/symex" xmlns:wpg="http://schemas.microsoft.com/office/word/2010/wordprocessingGroup" xmlns:wpi="http://schemas.microsoft.com/office/word/2010/wordprocessingInk" xmlns:wne="http://schemas.microsoft.com/office/word/2006/wordml" xmlns:wps="http://schemas.microsoft.com/office/word/2010/wordprocessingShape" mc:Ignorable="w14 w15 w16se w16cid w16 w16cex w16sdtdh w16sdtfl w16du wp14">
+<w:document xmlns:wpc="http://schemas.microsoft.com/office/word/2010/wordprocessingCanvas" xmlns:cx="http://schemas.microsoft.com/office/drawing/2014/chartex" xmlns:cx1="http://schemas.microsoft.com/office/drawing/2015/9/8/chartex" xmlns:cx2="http://schemas.microsoft.com/office/drawing/2015/10/21/chartex" xmlns:cx3="http://schemas.microsoft.com/office/drawing/2016/5/9/chartex" xmlns:cx4="http://schemas.microsoft.com/office/drawing/2016/5/10/chartex" xmlns:cx5="http://schemas.microsoft.com/office/drawing/2016/5/11/chartex" xmlns:cx6="http://schemas.microsoft.com/office/drawing/2016/5/12/chartex" xmlns:cx7="http://schemas.microsoft.com/office/drawing/2016/5/13/chartex" xmlns:cx8="http://schemas.microsoft.com/office/drawing/2016/5/14/chartex" xmlns:mc="http://schemas.openxmlformats.org/markup-compatibility/2006" xmlns:aink="http://schemas.microsoft.com/office/drawing/2016/ink" xmlns:am3d="http://schemas.microsoft.com/office/drawing/2017/model3d" xmlns:o="urn:schemas-microsoft-com:office:office" xmlns:r="http://schemas.openxmlformats.org/officeDocument/2006/relationships" xmlns:m="http://schemas.openxmlformats.org/officeDocument/2006/math" xmlns:v="urn:schemas-microsoft-com:vml" xmlns:wp14="http://schemas.microsoft.com/office/word/2010/wordprocessingDrawing" xmlns:wp="http://schemas.openxmlformats.org/drawingml/2006/wordprocessingDrawing" xmlns:w10="urn:schemas-microsoft-com:office:word" xmlns:w="http://schemas.openxmlformats.org/wordprocessingml/2006/main" xmlns:w14="http://schemas.microsoft.com/office/word/2010/wordml" xmlns:w15="http://schemas.microsoft.com/office/word/2012/wordml" xmlns:w16cex="http://schemas.microsoft.com/office/word/2018/wordml/cex" xmlns:w16cid="http://schemas.microsoft.com/office/word/2016/wordml/cid" xmlns:w16="http://schemas.microsoft.com/office/word/2018/wordml" xmlns:w16sdtdh="http://schemas.microsoft.com/office/word/2020/wordml/sdtdatahash" xmlns:w16se="http://schemas.microsoft.com/office/word/2015/wordml/symex" xmlns:wpg="http://schemas.microsoft.com/office/word/2010/wordprocessingGroup" xmlns:wpi="http://schemas.microsoft.com/office/word/2010/wordprocessingInk" xmlns:wne="http://schemas.microsoft.com/office/word/2006/wordml" xmlns:wps="http://schemas.microsoft.com/office/word/2010/wordprocessingShape" mc:Ignorable="w14 w15 w16se w16cid w16 w16cex w16sdtdh wp14">
   <w:body>
     <w:p>
       <w:pPr>
@@ -143,7 +143,7 @@
               </wp:inline>
             </w:drawing>
           </mc:Choice>
-          <mc:Fallback>
+          <mc:Fallback xmlns:w16sdtfl="http://schemas.microsoft.com/office/word/2024/wordml/sdtformatlock" xmlns:w16du="http://schemas.microsoft.com/office/word/2023/wordml/word16du" xmlns:oel="http://schemas.microsoft.com/office/2019/extlst">
             <w:pict>
               <v:group w14:anchorId="3BFA7711" id="Group 3065" o:spid="_x0000_s1026" style="width:435.05pt;height:.95pt;mso-position-horizontal-relative:char;mso-position-vertical-relative:line" coordsize="55250,121" o:gfxdata="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">
                 <v:shape id="Shape 3715" o:spid="_x0000_s1027" style="position:absolute;width:55250;height:121;visibility:visible;mso-wrap-style:square;v-text-anchor:top" coordsize="5525009,12192" o:gfxdata="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" path="m,l5525009,r,12192l,12192,,e" fillcolor="#4f81bd" stroked="f" strokeweight="0">
@@ -231,15 +231,7 @@
         <w:t>241001763</w:t>
       </w:r>
       <w:r>
-        <w:t xml:space="preserve">, </w:t>
-      </w:r>
-      <w:proofErr w:type="spellStart"/>
-      <w:r>
-        <w:t>BahaaEldin</w:t>
-      </w:r>
-      <w:proofErr w:type="spellEnd"/>
-      <w:r>
-        <w:t xml:space="preserve"> Bakry-</w:t>
+        <w:t>, BahaaEldin Bakry-</w:t>
       </w:r>
       <w:r>
         <w:t>241000433</w:t>
@@ -516,7 +508,10 @@
         <w:ind w:left="360" w:right="5465"/>
       </w:pPr>
       <w:r>
-        <w:t>Figure 3. Activity Diagram for UC-01 Figure 4. Activity Diagram for UC-02 Figure 5. Activity Diagram for UC-03 Figure 6. Activity Diagram for UC-04 Figure 7. Activity Diagram for UC-05 Figure 8. Activity Diagram for UC-06 Figure 9. Activity Diagram for UC-07 Figure</w:t>
+        <w:t xml:space="preserve">Figure 3. Activity </w:t>
+      </w:r>
+      <w:r>
+        <w:t>Diagram for UC-01 Figure 4. Activity Diagram for UC-02 Figure 5. Activity Diagram for UC-03 Figure 6. Activity Diagram for UC-04 Figure 7. Activity Diagram for UC-05 Figure 8. Activity Diagram for UC-06 Figure 9. Activity Diagram for UC-07 Figure</w:t>
       </w:r>
       <w:r>
         <w:rPr>
@@ -534,7 +529,10 @@
         <w:t xml:space="preserve"> </w:t>
       </w:r>
       <w:r>
-        <w:t>Activity</w:t>
+        <w:t>Activ</w:t>
+      </w:r>
+      <w:r>
+        <w:t>ity</w:t>
       </w:r>
       <w:r>
         <w:rPr>
@@ -764,7 +762,10 @@
         <w:ind w:left="360" w:right="5465"/>
       </w:pPr>
       <w:r>
-        <w:t>Table 1. Use Case UC-01 Description Table 2. Use Case UC-02 Description Table 3. Use Case UC-03 Description Table 4. Use Case UC-04 Description Table 5. Use Case UC-05 Description Table 6. Use Case UC-06 Description Table 7. Use Case UC-07 Description Table 8. Use Case UC-08 Description Table 9. Use Case UC-09 Description Table</w:t>
+        <w:t>Table 1. Use Case UC-01 Description Table 2. Use Case UC-02 Description Table 3. Use Case UC-03 D</w:t>
+      </w:r>
+      <w:r>
+        <w:t>escription Table 4. Use Case UC-04 Description Table 5. Use Case UC-05 Description Table 6. Use Case UC-06 Description Table 7. Use Case UC-07 Description Table 8. Use Case UC-08 Description Table 9. Use Case UC-09 Description Table</w:t>
       </w:r>
       <w:r>
         <w:rPr>
@@ -809,7 +810,10 @@
         <w:t xml:space="preserve"> </w:t>
       </w:r>
       <w:r>
-        <w:t>Description Table</w:t>
+        <w:t>Desc</w:t>
+      </w:r>
+      <w:r>
+        <w:t>ription Table</w:t>
       </w:r>
       <w:r>
         <w:rPr>
@@ -1042,6 +1046,21 @@
     </w:p>
     <w:p>
       <w:pPr>
+        <w:pStyle w:val="NormalWeb"/>
+        <w:ind w:left="360"/>
+      </w:pPr>
+    </w:p>
+    <w:p>
+      <w:pPr>
+        <w:pStyle w:val="NormalWeb"/>
+        <w:ind w:left="360"/>
+      </w:pPr>
+      <w:r>
+        <w:t>Blah blah blah gibberish</w:t>
+      </w:r>
+    </w:p>
+    <w:p>
+      <w:pPr>
         <w:pStyle w:val="BodyText"/>
       </w:pPr>
       <w:r>
@@ -1578,7 +1597,11 @@
         <w:t xml:space="preserve"> to process transactions</w:t>
       </w:r>
       <w:r>
-        <w:t xml:space="preserve"> safely, the application will also need good security to avoid any data being corrupted</w:t>
+        <w:t xml:space="preserve"> safely, </w:t>
+      </w:r>
+      <w:r>
+        <w:lastRenderedPageBreak/>
+        <w:t>the application will also need good security to avoid any data being corrupted</w:t>
       </w:r>
       <w:r>
         <w:t xml:space="preserve">. The application </w:t>
@@ -1740,6 +1763,21 @@
     </w:p>
     <w:p>
       <w:pPr>
+        <w:pStyle w:val="NormalWeb"/>
+        <w:ind w:left="359"/>
+      </w:pPr>
+    </w:p>
+    <w:p>
+      <w:pPr>
+        <w:pStyle w:val="NormalWeb"/>
+        <w:ind w:left="359"/>
+      </w:pPr>
+      <w:r>
+        <w:t>Gibberish and more gibberish</w:t>
+      </w:r>
+    </w:p>
+    <w:p>
+      <w:pPr>
         <w:pStyle w:val="Heading2"/>
         <w:numPr>
           <w:ilvl w:val="1"/>
@@ -1824,26 +1862,10 @@
         <w:t>The first problem is</w:t>
       </w:r>
       <w:r>
-        <w:t xml:space="preserve"> </w:t>
-      </w:r>
-      <w:proofErr w:type="gramStart"/>
-      <w:r>
-        <w:t>in the</w:t>
-      </w:r>
-      <w:proofErr w:type="gramEnd"/>
-      <w:r>
-        <w:t xml:space="preserve"> </w:t>
-      </w:r>
-      <w:proofErr w:type="gramStart"/>
-      <w:r>
-        <w:t xml:space="preserve">efficiency </w:t>
-      </w:r>
-      <w:r>
-        <w:t>.</w:t>
-      </w:r>
-      <w:proofErr w:type="gramEnd"/>
-      <w:r>
-        <w:t xml:space="preserve"> Customers need a clear process that allows them to browse products, select items, manage their carts, and place orders without unnecessary steps or </w:t>
+        <w:t xml:space="preserve"> in the efficiency </w:t>
+      </w:r>
+      <w:r>
+        <w:t xml:space="preserve">. Customers need a clear process that allows them to browse products, select items, manage their carts, and place orders without unnecessary steps or </w:t>
       </w:r>
       <w:r>
         <w:t>loss</w:t>
@@ -1910,7 +1932,10 @@
         <w:ind w:left="360" w:right="677"/>
       </w:pPr>
       <w:r>
-        <w:t>List objectives users expect from the system and how success will be measured. It may include</w:t>
+        <w:t xml:space="preserve">List </w:t>
+      </w:r>
+      <w:r>
+        <w:t>objectives users expect from the system and how success will be measured. It may include</w:t>
       </w:r>
       <w:r>
         <w:rPr>
@@ -1918,7 +1943,6 @@
         </w:rPr>
         <w:t xml:space="preserve"> </w:t>
       </w:r>
-      <w:proofErr w:type="gramStart"/>
       <w:r>
         <w:t>a</w:t>
       </w:r>
@@ -1931,7 +1955,6 @@
       <w:r>
         <w:t>”wish</w:t>
       </w:r>
-      <w:proofErr w:type="gramEnd"/>
       <w:r>
         <w:rPr>
           <w:spacing w:val="-4"/>
@@ -2087,7 +2110,10 @@
         <w:t xml:space="preserve"> </w:t>
       </w:r>
       <w:r>
-        <w:t>legal,</w:t>
+        <w:t>l</w:t>
+      </w:r>
+      <w:r>
+        <w:t>egal,</w:t>
       </w:r>
       <w:r>
         <w:rPr>
@@ -2314,6 +2340,7 @@
         <w:rPr>
           <w:color w:val="365F91"/>
         </w:rPr>
+        <w:lastRenderedPageBreak/>
         <w:t>3.1.</w:t>
       </w:r>
       <w:r>
@@ -2451,20 +2478,7 @@
         </w:rPr>
       </w:pPr>
       <w:r>
-        <w:t xml:space="preserve">This section lists the functional requirements in ranked order. Functional </w:t>
-      </w:r>
-      <w:proofErr w:type="gramStart"/>
-      <w:r>
-        <w:t xml:space="preserve">require- </w:t>
-      </w:r>
-      <w:proofErr w:type="spellStart"/>
-      <w:r>
-        <w:t>ments</w:t>
-      </w:r>
-      <w:proofErr w:type="spellEnd"/>
-      <w:proofErr w:type="gramEnd"/>
-      <w:r>
-        <w:t xml:space="preserve"> describes</w:t>
+        <w:t>This section lists the functional requirements in ranked order. Functional require- ments describes</w:t>
       </w:r>
       <w:r>
         <w:rPr>
@@ -2482,15 +2496,10 @@
         <w:t xml:space="preserve"> </w:t>
       </w:r>
       <w:r>
-        <w:t xml:space="preserve">effects of a software system, in other words, what the system must accomplish. Other kinds of requirements (such as interface re- </w:t>
-      </w:r>
-      <w:proofErr w:type="spellStart"/>
-      <w:r>
-        <w:t>quirements</w:t>
-      </w:r>
-      <w:proofErr w:type="spellEnd"/>
-      <w:r>
-        <w:t>, performance requirements, or reliability requirements) describe how the system accomplishes its functional</w:t>
+        <w:t>effects of a software system, in other words, what the system must accomplish. Other kinds of requirements (such as interface re- quire</w:t>
+      </w:r>
+      <w:r>
+        <w:t>ments, performance requirements, or reliability requirements) describe how the system accomplishes its functional</w:t>
       </w:r>
       <w:r>
         <w:rPr>
@@ -2561,11 +2570,9 @@
         </w:rPr>
         <w:t xml:space="preserve"> </w:t>
       </w:r>
-      <w:proofErr w:type="spellStart"/>
       <w:r>
         <w:t>quirement</w:t>
       </w:r>
-      <w:proofErr w:type="spellEnd"/>
       <w:r>
         <w:rPr>
           <w:spacing w:val="-3"/>
@@ -2609,19 +2616,7 @@
         <w:t xml:space="preserve"> </w:t>
       </w:r>
       <w:r>
-        <w:t xml:space="preserve">a </w:t>
-      </w:r>
-      <w:r>
-        <w:lastRenderedPageBreak/>
-        <w:t xml:space="preserve">format </w:t>
-      </w:r>
-      <w:proofErr w:type="gramStart"/>
-      <w:r>
-        <w:t>similar to</w:t>
-      </w:r>
-      <w:proofErr w:type="gramEnd"/>
-      <w:r>
-        <w:t xml:space="preserve"> the following:</w:t>
+        <w:t>a format similar to the following:</w:t>
       </w:r>
       <w:r>
         <w:rPr>
@@ -3019,23 +3014,7 @@
               <w:ind w:left="360" w:right="509"/>
             </w:pPr>
             <w:r>
-              <w:t xml:space="preserve">Describes the circumstances under which this requirement might </w:t>
-            </w:r>
-            <w:proofErr w:type="gramStart"/>
-            <w:r>
-              <w:t>not</w:t>
-            </w:r>
-            <w:proofErr w:type="gramEnd"/>
-            <w:r>
-              <w:t xml:space="preserve"> </w:t>
-            </w:r>
-            <w:proofErr w:type="gramStart"/>
-            <w:r>
-              <w:t>able</w:t>
-            </w:r>
-            <w:proofErr w:type="gramEnd"/>
-            <w:r>
-              <w:t xml:space="preserve"> to be satisfied, and what actions can be taken to reduce the probability of this occurrence.</w:t>
+              <w:t>Describes the circumstances under which this requirement might not able to be satisfied, and what actions can be taken to reduce the probability of this occurrence.</w:t>
             </w:r>
           </w:p>
         </w:tc>
@@ -3062,15 +3041,7 @@
               <w:ind w:left="360" w:right="509"/>
             </w:pPr>
             <w:r>
-              <w:t xml:space="preserve">Dependencies </w:t>
-            </w:r>
-            <w:proofErr w:type="gramStart"/>
-            <w:r>
-              <w:t>with</w:t>
-            </w:r>
-            <w:proofErr w:type="gramEnd"/>
-            <w:r>
-              <w:t xml:space="preserve"> other requirements</w:t>
+              <w:t>Dependencies with other requirements</w:t>
             </w:r>
           </w:p>
         </w:tc>
@@ -3190,15 +3161,7 @@
               <w:ind w:left="360" w:right="509"/>
             </w:pPr>
             <w:r>
-              <w:t xml:space="preserve">The state of the system after the </w:t>
-            </w:r>
-            <w:proofErr w:type="gramStart"/>
-            <w:r>
-              <w:t>run</w:t>
-            </w:r>
-            <w:proofErr w:type="gramEnd"/>
-            <w:r>
-              <w:t xml:space="preserve"> of the function</w:t>
+              <w:t>The state of the system after the run of the function</w:t>
             </w:r>
           </w:p>
         </w:tc>
@@ -3359,6 +3322,7 @@
               <w:ind w:left="360" w:right="509"/>
             </w:pPr>
             <w:r>
+              <w:lastRenderedPageBreak/>
               <w:t>Add Products to Cart</w:t>
             </w:r>
           </w:p>
@@ -3520,7 +3484,6 @@
               <w:ind w:left="360" w:right="509"/>
             </w:pPr>
             <w:r>
-              <w:lastRenderedPageBreak/>
               <w:t>Technical issues</w:t>
             </w:r>
           </w:p>
@@ -3713,23 +3676,7 @@
               <w:ind w:left="360" w:right="509"/>
             </w:pPr>
             <w:r>
-              <w:t xml:space="preserve">Describes the circumstances under which this requirement might </w:t>
-            </w:r>
-            <w:proofErr w:type="gramStart"/>
-            <w:r>
-              <w:t>not</w:t>
-            </w:r>
-            <w:proofErr w:type="gramEnd"/>
-            <w:r>
-              <w:t xml:space="preserve"> </w:t>
-            </w:r>
-            <w:proofErr w:type="gramStart"/>
-            <w:r>
-              <w:t>able</w:t>
-            </w:r>
-            <w:proofErr w:type="gramEnd"/>
-            <w:r>
-              <w:t xml:space="preserve"> to be satisfied, and what actions can be taken to reduce the probability of this occurrence.</w:t>
+              <w:t>Describes the circumstances under which this requirement might not able to be satisfied, and what actions can be taken to reduce the probability of this occurrence.</w:t>
             </w:r>
           </w:p>
         </w:tc>
@@ -3756,15 +3703,7 @@
               <w:ind w:left="360" w:right="509"/>
             </w:pPr>
             <w:r>
-              <w:t xml:space="preserve">Dependencies </w:t>
-            </w:r>
-            <w:proofErr w:type="gramStart"/>
-            <w:r>
-              <w:t>with</w:t>
-            </w:r>
-            <w:proofErr w:type="gramEnd"/>
-            <w:r>
-              <w:t xml:space="preserve"> other requirements</w:t>
+              <w:t>Dependencies with other requirements</w:t>
             </w:r>
           </w:p>
         </w:tc>
@@ -3884,15 +3823,7 @@
               <w:ind w:left="360" w:right="509"/>
             </w:pPr>
             <w:r>
-              <w:t xml:space="preserve">The state of the system after the </w:t>
-            </w:r>
-            <w:proofErr w:type="gramStart"/>
-            <w:r>
-              <w:t>run</w:t>
-            </w:r>
-            <w:proofErr w:type="gramEnd"/>
-            <w:r>
-              <w:t xml:space="preserve"> of the function</w:t>
+              <w:t>The state of the system after the run of the function</w:t>
             </w:r>
           </w:p>
         </w:tc>
@@ -4253,6 +4184,7 @@
               <w:ind w:left="360" w:right="509"/>
             </w:pPr>
             <w:r>
+              <w:lastRenderedPageBreak/>
               <w:t>Cost and</w:t>
             </w:r>
           </w:p>
@@ -4374,7 +4306,6 @@
               <w:ind w:left="360" w:right="509"/>
             </w:pPr>
             <w:r>
-              <w:lastRenderedPageBreak/>
               <w:t>Risks</w:t>
             </w:r>
           </w:p>
@@ -4397,23 +4328,7 @@
               <w:ind w:left="360" w:right="509"/>
             </w:pPr>
             <w:r>
-              <w:t xml:space="preserve">Describes the circumstances under which this requirement might </w:t>
-            </w:r>
-            <w:proofErr w:type="gramStart"/>
-            <w:r>
-              <w:t>not</w:t>
-            </w:r>
-            <w:proofErr w:type="gramEnd"/>
-            <w:r>
-              <w:t xml:space="preserve"> </w:t>
-            </w:r>
-            <w:proofErr w:type="gramStart"/>
-            <w:r>
-              <w:t>able</w:t>
-            </w:r>
-            <w:proofErr w:type="gramEnd"/>
-            <w:r>
-              <w:t xml:space="preserve"> to be satisfied, and what actions can be taken to reduce the probability of this occurrence.</w:t>
+              <w:t>Describes the circumstances under which this requirement might not able to be satisfied, and what actions can be taken to reduce the probability of this occurrence.</w:t>
             </w:r>
           </w:p>
         </w:tc>
@@ -4440,15 +4355,7 @@
               <w:ind w:left="360" w:right="509"/>
             </w:pPr>
             <w:r>
-              <w:t xml:space="preserve">Dependencies </w:t>
-            </w:r>
-            <w:proofErr w:type="gramStart"/>
-            <w:r>
-              <w:t>with</w:t>
-            </w:r>
-            <w:proofErr w:type="gramEnd"/>
-            <w:r>
-              <w:t xml:space="preserve"> other requirements</w:t>
+              <w:t>Dependencies with other requirements</w:t>
             </w:r>
           </w:p>
         </w:tc>
@@ -4568,15 +4475,7 @@
               <w:ind w:left="360" w:right="509"/>
             </w:pPr>
             <w:r>
-              <w:t xml:space="preserve">The state of the system after the </w:t>
-            </w:r>
-            <w:proofErr w:type="gramStart"/>
-            <w:r>
-              <w:t>run</w:t>
-            </w:r>
-            <w:proofErr w:type="gramEnd"/>
-            <w:r>
-              <w:t xml:space="preserve"> of the function</w:t>
+              <w:t>The state of the system after the run of the function</w:t>
             </w:r>
           </w:p>
         </w:tc>
@@ -5073,23 +4972,7 @@
               <w:ind w:left="360" w:right="509"/>
             </w:pPr>
             <w:r>
-              <w:t xml:space="preserve">Describes the circumstances under which this requirement might </w:t>
-            </w:r>
-            <w:proofErr w:type="gramStart"/>
-            <w:r>
-              <w:t>not</w:t>
-            </w:r>
-            <w:proofErr w:type="gramEnd"/>
-            <w:r>
-              <w:t xml:space="preserve"> </w:t>
-            </w:r>
-            <w:proofErr w:type="gramStart"/>
-            <w:r>
-              <w:t>able</w:t>
-            </w:r>
-            <w:proofErr w:type="gramEnd"/>
-            <w:r>
-              <w:t xml:space="preserve"> to be satisfied, and what actions can be taken to reduce the probability of this occurrence.</w:t>
+              <w:t>Describes the circumstances under which this requirement might not able to be satisfied, and what actions can be taken to reduce the probability of this occurrence.</w:t>
             </w:r>
           </w:p>
         </w:tc>
@@ -5116,15 +4999,8 @@
               <w:ind w:left="360" w:right="509"/>
             </w:pPr>
             <w:r>
-              <w:t xml:space="preserve">Dependencies </w:t>
-            </w:r>
-            <w:proofErr w:type="gramStart"/>
-            <w:r>
-              <w:t>with</w:t>
-            </w:r>
-            <w:proofErr w:type="gramEnd"/>
-            <w:r>
-              <w:t xml:space="preserve"> other requirements</w:t>
+              <w:lastRenderedPageBreak/>
+              <w:t>Dependencies with other requirements</w:t>
             </w:r>
           </w:p>
         </w:tc>
@@ -5244,15 +5120,7 @@
               <w:ind w:left="360" w:right="509"/>
             </w:pPr>
             <w:r>
-              <w:t xml:space="preserve">The state of the system after the </w:t>
-            </w:r>
-            <w:proofErr w:type="gramStart"/>
-            <w:r>
-              <w:t>run</w:t>
-            </w:r>
-            <w:proofErr w:type="gramEnd"/>
-            <w:r>
-              <w:t xml:space="preserve"> of the function</w:t>
+              <w:t>The state of the system after the run of the function</w:t>
             </w:r>
           </w:p>
         </w:tc>
@@ -5279,7 +5147,6 @@
               <w:ind w:left="360" w:right="509"/>
             </w:pPr>
             <w:r>
-              <w:lastRenderedPageBreak/>
               <w:t>Input</w:t>
             </w:r>
           </w:p>
@@ -5485,15 +5352,7 @@
               <w:ind w:left="360" w:right="509"/>
             </w:pPr>
             <w:r>
-              <w:t xml:space="preserve">The system shall allow the customer to change the quantity of a certain item whether to decrease or increase rather than making multiple orders of one item. The system </w:t>
-            </w:r>
-            <w:proofErr w:type="gramStart"/>
-            <w:r>
-              <w:t>shall</w:t>
-            </w:r>
-            <w:proofErr w:type="gramEnd"/>
-            <w:r>
-              <w:t xml:space="preserve"> update the total amount that will be paid based on the number of times the customer wants the item. The quantity will be a positive whole number </w:t>
+              <w:t>The system shall allow the customer to change the quantity of a certain item whether to decrease or increase rather than making multiple orders of one item. The system shall update the total amount that will be paid based on the number of times the customer wants the item. The quantity will be a positive whole number </w:t>
             </w:r>
           </w:p>
         </w:tc>
@@ -5542,23 +5401,7 @@
               <w:ind w:left="360" w:right="509"/>
             </w:pPr>
             <w:r>
-              <w:t xml:space="preserve">High. This function allows the customer to change their purchases according to the amount they want of that </w:t>
-            </w:r>
-            <w:proofErr w:type="gramStart"/>
-            <w:r>
-              <w:t>item ,this</w:t>
-            </w:r>
-            <w:proofErr w:type="gramEnd"/>
-            <w:r>
-              <w:t xml:space="preserve"> also </w:t>
-            </w:r>
-            <w:proofErr w:type="gramStart"/>
-            <w:r>
-              <w:t>has an effect on</w:t>
-            </w:r>
-            <w:proofErr w:type="gramEnd"/>
-            <w:r>
-              <w:t xml:space="preserve"> the payment amount. </w:t>
+              <w:t>High. This function allows the customer to change their purchases according to the amount they want of that item ,this also has an effect on the payment amount. </w:t>
             </w:r>
           </w:p>
         </w:tc>
@@ -5821,15 +5664,8 @@
               <w:ind w:left="360" w:right="509"/>
             </w:pPr>
             <w:r>
-              <w:t xml:space="preserve">Dependencies </w:t>
-            </w:r>
-            <w:proofErr w:type="gramStart"/>
-            <w:r>
-              <w:t>with</w:t>
-            </w:r>
-            <w:proofErr w:type="gramEnd"/>
-            <w:r>
-              <w:t xml:space="preserve"> other requirements</w:t>
+              <w:lastRenderedPageBreak/>
+              <w:t>Dependencies with other requirements</w:t>
             </w:r>
           </w:p>
         </w:tc>
@@ -5927,7 +5763,6 @@
               <w:ind w:left="360" w:right="509"/>
             </w:pPr>
             <w:r>
-              <w:lastRenderedPageBreak/>
               <w:t>Post-Condition</w:t>
             </w:r>
           </w:p>
@@ -5998,13 +5833,8 @@
               <w:spacing w:before="239" w:line="276" w:lineRule="auto"/>
               <w:ind w:left="360" w:right="509"/>
             </w:pPr>
-            <w:proofErr w:type="gramStart"/>
-            <w:r>
-              <w:t>The selected item and its new quantity,</w:t>
-            </w:r>
-            <w:proofErr w:type="gramEnd"/>
-            <w:r>
-              <w:t xml:space="preserve"> entered directly or adjusted using increase/decrease controls. </w:t>
+            <w:r>
+              <w:t>The selected item and its new quantity, entered directly or adjusted using increase/decrease controls. </w:t>
             </w:r>
           </w:p>
         </w:tc>
@@ -6053,15 +5883,7 @@
               <w:ind w:left="360" w:right="509"/>
             </w:pPr>
             <w:r>
-              <w:t xml:space="preserve">The updated shopping cart </w:t>
-            </w:r>
-            <w:proofErr w:type="gramStart"/>
-            <w:r>
-              <w:t>displaying</w:t>
-            </w:r>
-            <w:proofErr w:type="gramEnd"/>
-            <w:r>
-              <w:t xml:space="preserve"> the new quantity, recalculated subtotal, and total price. An error message is displayed if the entered quantity is invalid. </w:t>
+              <w:t>The updated shopping cart displaying the new quantity, recalculated subtotal, and total price. An error message is displayed if the entered quantity is invalid. </w:t>
             </w:r>
           </w:p>
         </w:tc>
@@ -6460,23 +6282,7 @@
               <w:ind w:left="360" w:right="509"/>
             </w:pPr>
             <w:r>
-              <w:t xml:space="preserve">Describes the circumstances under which this requirement might </w:t>
-            </w:r>
-            <w:proofErr w:type="gramStart"/>
-            <w:r>
-              <w:t>not</w:t>
-            </w:r>
-            <w:proofErr w:type="gramEnd"/>
-            <w:r>
-              <w:t xml:space="preserve"> </w:t>
-            </w:r>
-            <w:proofErr w:type="gramStart"/>
-            <w:r>
-              <w:t>able</w:t>
-            </w:r>
-            <w:proofErr w:type="gramEnd"/>
-            <w:r>
-              <w:t xml:space="preserve"> to be satisfied, and what actions can be taken to reduce the probability of this occurrence.</w:t>
+              <w:t>Describes the circumstances under which this requirement might not able to be satisfied, and what actions can be taken to reduce the probability of this occurrence.</w:t>
             </w:r>
           </w:p>
         </w:tc>
@@ -6503,15 +6309,7 @@
               <w:ind w:left="360" w:right="509"/>
             </w:pPr>
             <w:r>
-              <w:t xml:space="preserve">Dependencies </w:t>
-            </w:r>
-            <w:proofErr w:type="gramStart"/>
-            <w:r>
-              <w:t>with</w:t>
-            </w:r>
-            <w:proofErr w:type="gramEnd"/>
-            <w:r>
-              <w:t xml:space="preserve"> other requirements</w:t>
+              <w:t>Dependencies with other requirements</w:t>
             </w:r>
           </w:p>
         </w:tc>
@@ -6560,6 +6358,7 @@
               <w:ind w:left="360" w:right="509"/>
             </w:pPr>
             <w:r>
+              <w:lastRenderedPageBreak/>
               <w:t>Pre-Condition</w:t>
             </w:r>
           </w:p>
@@ -6631,15 +6430,7 @@
               <w:ind w:left="360" w:right="509"/>
             </w:pPr>
             <w:r>
-              <w:t xml:space="preserve">The state of the system after the </w:t>
-            </w:r>
-            <w:proofErr w:type="gramStart"/>
-            <w:r>
-              <w:t>run</w:t>
-            </w:r>
-            <w:proofErr w:type="gramEnd"/>
-            <w:r>
-              <w:t xml:space="preserve"> of the function</w:t>
+              <w:t>The state of the system after the run of the function</w:t>
             </w:r>
           </w:p>
         </w:tc>
@@ -7136,23 +6927,7 @@
               <w:ind w:left="360" w:right="509"/>
             </w:pPr>
             <w:r>
-              <w:t xml:space="preserve">Describes the circumstances under which this requirement might </w:t>
-            </w:r>
-            <w:proofErr w:type="gramStart"/>
-            <w:r>
-              <w:t>not</w:t>
-            </w:r>
-            <w:proofErr w:type="gramEnd"/>
-            <w:r>
-              <w:t xml:space="preserve"> </w:t>
-            </w:r>
-            <w:proofErr w:type="gramStart"/>
-            <w:r>
-              <w:t>able</w:t>
-            </w:r>
-            <w:proofErr w:type="gramEnd"/>
-            <w:r>
-              <w:t xml:space="preserve"> to be satisfied, and what actions can be taken to reduce the probability of this occurrence.</w:t>
+              <w:t>Describes the circumstances under which this requirement might not able to be satisfied, and what actions can be taken to reduce the probability of this occurrence.</w:t>
             </w:r>
           </w:p>
         </w:tc>
@@ -7179,15 +6954,7 @@
               <w:ind w:left="360" w:right="509"/>
             </w:pPr>
             <w:r>
-              <w:t xml:space="preserve">Dependencies </w:t>
-            </w:r>
-            <w:proofErr w:type="gramStart"/>
-            <w:r>
-              <w:t>with</w:t>
-            </w:r>
-            <w:proofErr w:type="gramEnd"/>
-            <w:r>
-              <w:t xml:space="preserve"> other requirements</w:t>
+              <w:t>Dependencies with other requirements</w:t>
             </w:r>
           </w:p>
         </w:tc>
@@ -7307,15 +7074,7 @@
               <w:ind w:left="360" w:right="509"/>
             </w:pPr>
             <w:r>
-              <w:t xml:space="preserve">The state of the system after the </w:t>
-            </w:r>
-            <w:proofErr w:type="gramStart"/>
-            <w:r>
-              <w:t>run</w:t>
-            </w:r>
-            <w:proofErr w:type="gramEnd"/>
-            <w:r>
-              <w:t xml:space="preserve"> of the function</w:t>
+              <w:t>The state of the system after the run of the function</w:t>
             </w:r>
           </w:p>
         </w:tc>
@@ -7990,11 +7749,9 @@
               </w:rPr>
               <w:t xml:space="preserve"> </w:t>
             </w:r>
-            <w:proofErr w:type="gramStart"/>
             <w:r>
               <w:t>requests</w:t>
             </w:r>
-            <w:proofErr w:type="gramEnd"/>
             <w:r>
               <w:rPr>
                 <w:spacing w:val="-8"/>
@@ -8680,21 +8437,7 @@
               <w:rPr>
                 <w:spacing w:val="-2"/>
               </w:rPr>
-              <w:t>(</w:t>
-            </w:r>
-            <w:proofErr w:type="spellStart"/>
-            <w:r>
-              <w:rPr>
-                <w:spacing w:val="-2"/>
-              </w:rPr>
-              <w:t>name+DOB+phone</w:t>
-            </w:r>
-            <w:proofErr w:type="spellEnd"/>
-            <w:r>
-              <w:rPr>
-                <w:spacing w:val="-2"/>
-              </w:rPr>
-              <w:t>).</w:t>
+              <w:t>(name+DOB+phone).</w:t>
             </w:r>
           </w:p>
           <w:p>
@@ -8745,19 +8488,11 @@
               </w:rPr>
               <w:t xml:space="preserve"> </w:t>
             </w:r>
-            <w:proofErr w:type="gramStart"/>
             <w:r>
               <w:rPr>
                 <w:spacing w:val="-2"/>
               </w:rPr>
-              <w:t>record</w:t>
-            </w:r>
-            <w:proofErr w:type="gramEnd"/>
-            <w:r>
-              <w:rPr>
-                <w:spacing w:val="-2"/>
-              </w:rPr>
-              <w:t>.</w:t>
+              <w:t>record.</w:t>
             </w:r>
           </w:p>
           <w:p>
@@ -8959,7 +8694,10 @@
               <w:t xml:space="preserve"> </w:t>
             </w:r>
             <w:r>
-              <w:t>links to existing record or confirms new.</w:t>
+              <w:t xml:space="preserve">links to </w:t>
+            </w:r>
+            <w:r>
+              <w:t>existing record or confirms new.</w:t>
             </w:r>
           </w:p>
           <w:p>
@@ -9158,13 +8896,8 @@
               <w:t xml:space="preserve"> </w:t>
             </w:r>
             <w:r>
-              <w:t xml:space="preserve">error messages within 200 </w:t>
-            </w:r>
-            <w:proofErr w:type="spellStart"/>
-            <w:r>
-              <w:t>ms.</w:t>
-            </w:r>
-            <w:proofErr w:type="spellEnd"/>
+              <w:t>error messages within 200 ms.</w:t>
+            </w:r>
           </w:p>
           <w:p>
             <w:pPr>
@@ -9223,11 +8956,9 @@
               </w:rPr>
               <w:t xml:space="preserve"> </w:t>
             </w:r>
-            <w:proofErr w:type="spellStart"/>
             <w:r>
               <w:t>ms</w:t>
             </w:r>
-            <w:proofErr w:type="spellEnd"/>
             <w:r>
               <w:rPr>
                 <w:spacing w:val="-4"/>
@@ -11812,7 +11543,10 @@
         <w:t xml:space="preserve"> </w:t>
       </w:r>
       <w:r>
-        <w:t>availability,</w:t>
+        <w:t>availab</w:t>
+      </w:r>
+      <w:r>
+        <w:t>ility,</w:t>
       </w:r>
       <w:r>
         <w:rPr>
@@ -12928,7 +12662,7 @@
 </file>
 
 <file path=word/numbering.xml><?xml version="1.0" encoding="utf-8"?>
-<w:numbering xmlns:wpc="http://schemas.microsoft.com/office/word/2010/wordprocessingCanvas" xmlns:cx="http://schemas.microsoft.com/office/drawing/2014/chartex" xmlns:cx1="http://schemas.microsoft.com/office/drawing/2015/9/8/chartex" xmlns:cx2="http://schemas.microsoft.com/office/drawing/2015/10/21/chartex" xmlns:cx3="http://schemas.microsoft.com/office/drawing/2016/5/9/chartex" xmlns:cx4="http://schemas.microsoft.com/office/drawing/2016/5/10/chartex" xmlns:cx5="http://schemas.microsoft.com/office/drawing/2016/5/11/chartex" xmlns:cx6="http://schemas.microsoft.com/office/drawing/2016/5/12/chartex" xmlns:cx7="http://schemas.microsoft.com/office/drawing/2016/5/13/chartex" xmlns:cx8="http://schemas.microsoft.com/office/drawing/2016/5/14/chartex" xmlns:mc="http://schemas.openxmlformats.org/markup-compatibility/2006" xmlns:aink="http://schemas.microsoft.com/office/drawing/2016/ink" xmlns:am3d="http://schemas.microsoft.com/office/drawing/2017/model3d" xmlns:o="urn:schemas-microsoft-com:office:office" xmlns:oel="http://schemas.microsoft.com/office/2019/extlst" xmlns:r="http://schemas.openxmlformats.org/officeDocument/2006/relationships" xmlns:m="http://schemas.openxmlformats.org/officeDocument/2006/math" xmlns:v="urn:schemas-microsoft-com:vml" xmlns:wp14="http://schemas.microsoft.com/office/word/2010/wordprocessingDrawing" xmlns:wp="http://schemas.openxmlformats.org/drawingml/2006/wordprocessingDrawing" xmlns:w10="urn:schemas-microsoft-com:office:word" xmlns:w="http://schemas.openxmlformats.org/wordprocessingml/2006/main" xmlns:w14="http://schemas.microsoft.com/office/word/2010/wordml" xmlns:w15="http://schemas.microsoft.com/office/word/2012/wordml" xmlns:w16cex="http://schemas.microsoft.com/office/word/2018/wordml/cex" xmlns:w16cid="http://schemas.microsoft.com/office/word/2016/wordml/cid" xmlns:w16="http://schemas.microsoft.com/office/word/2018/wordml" xmlns:w16du="http://schemas.microsoft.com/office/word/2023/wordml/word16du" xmlns:w16sdtdh="http://schemas.microsoft.com/office/word/2020/wordml/sdtdatahash" xmlns:w16sdtfl="http://schemas.microsoft.com/office/word/2024/wordml/sdtformatlock" xmlns:w16se="http://schemas.microsoft.com/office/word/2015/wordml/symex" xmlns:wpg="http://schemas.microsoft.com/office/word/2010/wordprocessingGroup" xmlns:wpi="http://schemas.microsoft.com/office/word/2010/wordprocessingInk" xmlns:wne="http://schemas.microsoft.com/office/word/2006/wordml" xmlns:wps="http://schemas.microsoft.com/office/word/2010/wordprocessingShape" mc:Ignorable="w14 w15 w16se w16cid w16 w16cex w16sdtdh w16sdtfl w16du wp14">
+<w:numbering xmlns:wpc="http://schemas.microsoft.com/office/word/2010/wordprocessingCanvas" xmlns:cx="http://schemas.microsoft.com/office/drawing/2014/chartex" xmlns:cx1="http://schemas.microsoft.com/office/drawing/2015/9/8/chartex" xmlns:cx2="http://schemas.microsoft.com/office/drawing/2015/10/21/chartex" xmlns:cx3="http://schemas.microsoft.com/office/drawing/2016/5/9/chartex" xmlns:cx4="http://schemas.microsoft.com/office/drawing/2016/5/10/chartex" xmlns:cx5="http://schemas.microsoft.com/office/drawing/2016/5/11/chartex" xmlns:cx6="http://schemas.microsoft.com/office/drawing/2016/5/12/chartex" xmlns:cx7="http://schemas.microsoft.com/office/drawing/2016/5/13/chartex" xmlns:cx8="http://schemas.microsoft.com/office/drawing/2016/5/14/chartex" xmlns:mc="http://schemas.openxmlformats.org/markup-compatibility/2006" xmlns:aink="http://schemas.microsoft.com/office/drawing/2016/ink" xmlns:am3d="http://schemas.microsoft.com/office/drawing/2017/model3d" xmlns:o="urn:schemas-microsoft-com:office:office" xmlns:r="http://schemas.openxmlformats.org/officeDocument/2006/relationships" xmlns:m="http://schemas.openxmlformats.org/officeDocument/2006/math" xmlns:v="urn:schemas-microsoft-com:vml" xmlns:wp14="http://schemas.microsoft.com/office/word/2010/wordprocessingDrawing" xmlns:wp="http://schemas.openxmlformats.org/drawingml/2006/wordprocessingDrawing" xmlns:w10="urn:schemas-microsoft-com:office:word" xmlns:w="http://schemas.openxmlformats.org/wordprocessingml/2006/main" xmlns:w14="http://schemas.microsoft.com/office/word/2010/wordml" xmlns:w15="http://schemas.microsoft.com/office/word/2012/wordml" xmlns:w16cex="http://schemas.microsoft.com/office/word/2018/wordml/cex" xmlns:w16cid="http://schemas.microsoft.com/office/word/2016/wordml/cid" xmlns:w16="http://schemas.microsoft.com/office/word/2018/wordml" xmlns:w16sdtdh="http://schemas.microsoft.com/office/word/2020/wordml/sdtdatahash" xmlns:w16se="http://schemas.microsoft.com/office/word/2015/wordml/symex" xmlns:wpg="http://schemas.microsoft.com/office/word/2010/wordprocessingGroup" xmlns:wpi="http://schemas.microsoft.com/office/word/2010/wordprocessingInk" xmlns:wne="http://schemas.microsoft.com/office/word/2006/wordml" xmlns:wps="http://schemas.microsoft.com/office/word/2010/wordprocessingShape" mc:Ignorable="w14 w15 w16se w16cid w16 w16cex w16sdtdh wp14">
   <w:abstractNum w:abstractNumId="0" w15:restartNumberingAfterBreak="0">
     <w:nsid w:val="154F35C5"/>
     <w:multiLevelType w:val="multilevel"/>
@@ -13934,35 +13668,35 @@
       </w:rPr>
     </w:lvl>
   </w:abstractNum>
-  <w:num w:numId="1" w16cid:durableId="1237596913">
+  <w:num w:numId="1">
     <w:abstractNumId w:val="5"/>
   </w:num>
-  <w:num w:numId="2" w16cid:durableId="638076573">
+  <w:num w:numId="2">
     <w:abstractNumId w:val="6"/>
   </w:num>
-  <w:num w:numId="3" w16cid:durableId="1933200454">
+  <w:num w:numId="3">
     <w:abstractNumId w:val="3"/>
   </w:num>
-  <w:num w:numId="4" w16cid:durableId="1808468104">
+  <w:num w:numId="4">
     <w:abstractNumId w:val="1"/>
   </w:num>
-  <w:num w:numId="5" w16cid:durableId="1381784372">
+  <w:num w:numId="5">
     <w:abstractNumId w:val="2"/>
   </w:num>
-  <w:num w:numId="6" w16cid:durableId="1109088054">
+  <w:num w:numId="6">
     <w:abstractNumId w:val="0"/>
   </w:num>
-  <w:num w:numId="7" w16cid:durableId="1495492233">
+  <w:num w:numId="7">
     <w:abstractNumId w:val="7"/>
   </w:num>
-  <w:num w:numId="8" w16cid:durableId="864708514">
+  <w:num w:numId="8">
     <w:abstractNumId w:val="4"/>
   </w:num>
 </w:numbering>
 </file>
 
 <file path=word/styles.xml><?xml version="1.0" encoding="utf-8"?>
-<w:styles xmlns:mc="http://schemas.openxmlformats.org/markup-compatibility/2006" xmlns:r="http://schemas.openxmlformats.org/officeDocument/2006/relationships" xmlns:w="http://schemas.openxmlformats.org/wordprocessingml/2006/main" xmlns:w14="http://schemas.microsoft.com/office/word/2010/wordml" xmlns:w15="http://schemas.microsoft.com/office/word/2012/wordml" xmlns:w16cex="http://schemas.microsoft.com/office/word/2018/wordml/cex" xmlns:w16cid="http://schemas.microsoft.com/office/word/2016/wordml/cid" xmlns:w16="http://schemas.microsoft.com/office/word/2018/wordml" xmlns:w16du="http://schemas.microsoft.com/office/word/2023/wordml/word16du" xmlns:w16sdtdh="http://schemas.microsoft.com/office/word/2020/wordml/sdtdatahash" xmlns:w16sdtfl="http://schemas.microsoft.com/office/word/2024/wordml/sdtformatlock" xmlns:w16se="http://schemas.microsoft.com/office/word/2015/wordml/symex" mc:Ignorable="w14 w15 w16se w16cid w16 w16cex w16sdtdh w16sdtfl w16du">
+<w:styles xmlns:mc="http://schemas.openxmlformats.org/markup-compatibility/2006" xmlns:r="http://schemas.openxmlformats.org/officeDocument/2006/relationships" xmlns:w="http://schemas.openxmlformats.org/wordprocessingml/2006/main" xmlns:w14="http://schemas.microsoft.com/office/word/2010/wordml" xmlns:w15="http://schemas.microsoft.com/office/word/2012/wordml" xmlns:w16cex="http://schemas.microsoft.com/office/word/2018/wordml/cex" xmlns:w16cid="http://schemas.microsoft.com/office/word/2016/wordml/cid" xmlns:w16="http://schemas.microsoft.com/office/word/2018/wordml" xmlns:w16sdtdh="http://schemas.microsoft.com/office/word/2020/wordml/sdtdatahash" xmlns:w16se="http://schemas.microsoft.com/office/word/2015/wordml/symex" mc:Ignorable="w14 w15 w16se w16cid w16 w16cex w16sdtdh">
   <w:docDefaults>
     <w:rPrDefault>
       <w:rPr>
@@ -14421,6 +14155,7 @@
   <w:style w:type="character" w:default="1" w:styleId="DefaultParagraphFont">
     <w:name w:val="Default Paragraph Font"/>
     <w:uiPriority w:val="1"/>
+    <w:semiHidden/>
     <w:unhideWhenUsed/>
   </w:style>
   <w:style w:type="table" w:default="1" w:styleId="TableNormal">

</xml_diff>